<commit_message>
ML:A2 v1.3 語境改寫(照 Kenny AIE 報告的寫法)+ 獨立核對 6 條修正 + to_pdf.ps1 修 Word COM 卡住
- 正文 36 段併 18 段、惟／亦／故推進、「本提案」自稱、圈號與→｜清 0;子項改段內「詞：」
- 數字多重集合不變、55 組中英並列位置不變、13 張表逐字相同
- 漢字 1,832／合計 1,983;PDF 23 頁;私註零洩漏
- 「特徵建構」改回「資料建構」;摘要因果句拆開;表 11 註「本提案」

Co-Authored-By: Claude Fable 5.1 <noreply@anthropic.com>
</commit_message>
<xml_diff>
--- a/Machine Learning/assessments/A2_交件/Huang_26254793_321513_A2.docx
+++ b/Machine Learning/assessments/A2_交件/Huang_26254793_321513_A2.docx
@@ -534,7 +534,7 @@
       <w:r>
         <w:fldChar w:fldCharType="separate"/>
       </w:r>
-      <w:hyperlink w:anchor="_Toc241868934" w:history="1">
+      <w:hyperlink w:anchor="_Toc241871944" w:history="1">
         <w:r>
           <w:rPr>
             <w:rStyle w:val="affa"/>
@@ -561,7 +561,7 @@
             <w:noProof/>
             <w:webHidden/>
           </w:rPr>
-          <w:instrText xml:space="preserve"> PAGEREF _Toc241868934 \h </w:instrText>
+          <w:instrText xml:space="preserve"> PAGEREF _Toc241871944 \h </w:instrText>
         </w:r>
         <w:r>
           <w:rPr>
@@ -602,7 +602,7 @@
           <w:noProof/>
         </w:rPr>
       </w:pPr>
-      <w:hyperlink w:anchor="_Toc241868935" w:history="1">
+      <w:hyperlink w:anchor="_Toc241871945" w:history="1">
         <w:r>
           <w:rPr>
             <w:rStyle w:val="affa"/>
@@ -636,7 +636,7 @@
             <w:noProof/>
             <w:webHidden/>
           </w:rPr>
-          <w:instrText xml:space="preserve"> PAGEREF _Toc241868935 \h </w:instrText>
+          <w:instrText xml:space="preserve"> PAGEREF _Toc241871945 \h </w:instrText>
         </w:r>
         <w:r>
           <w:rPr>
@@ -677,7 +677,7 @@
           <w:noProof/>
         </w:rPr>
       </w:pPr>
-      <w:hyperlink w:anchor="_Toc241868936" w:history="1">
+      <w:hyperlink w:anchor="_Toc241871946" w:history="1">
         <w:r>
           <w:rPr>
             <w:rStyle w:val="affa"/>
@@ -711,7 +711,7 @@
             <w:noProof/>
             <w:webHidden/>
           </w:rPr>
-          <w:instrText xml:space="preserve"> PAGEREF _Toc241868936 \h </w:instrText>
+          <w:instrText xml:space="preserve"> PAGEREF _Toc241871946 \h </w:instrText>
         </w:r>
         <w:r>
           <w:rPr>
@@ -752,7 +752,7 @@
           <w:noProof/>
         </w:rPr>
       </w:pPr>
-      <w:hyperlink w:anchor="_Toc241868937" w:history="1">
+      <w:hyperlink w:anchor="_Toc241871947" w:history="1">
         <w:r>
           <w:rPr>
             <w:rStyle w:val="affa"/>
@@ -786,7 +786,7 @@
             <w:noProof/>
             <w:webHidden/>
           </w:rPr>
-          <w:instrText xml:space="preserve"> PAGEREF _Toc241868937 \h </w:instrText>
+          <w:instrText xml:space="preserve"> PAGEREF _Toc241871947 \h </w:instrText>
         </w:r>
         <w:r>
           <w:rPr>
@@ -827,7 +827,7 @@
           <w:noProof/>
         </w:rPr>
       </w:pPr>
-      <w:hyperlink w:anchor="_Toc241868938" w:history="1">
+      <w:hyperlink w:anchor="_Toc241871948" w:history="1">
         <w:r>
           <w:rPr>
             <w:rStyle w:val="affa"/>
@@ -861,7 +861,7 @@
             <w:noProof/>
             <w:webHidden/>
           </w:rPr>
-          <w:instrText xml:space="preserve"> PAGEREF _Toc241868938 \h </w:instrText>
+          <w:instrText xml:space="preserve"> PAGEREF _Toc241871948 \h </w:instrText>
         </w:r>
         <w:r>
           <w:rPr>
@@ -902,7 +902,7 @@
           <w:noProof/>
         </w:rPr>
       </w:pPr>
-      <w:hyperlink w:anchor="_Toc241868939" w:history="1">
+      <w:hyperlink w:anchor="_Toc241871949" w:history="1">
         <w:r>
           <w:rPr>
             <w:rStyle w:val="affa"/>
@@ -936,7 +936,7 @@
             <w:noProof/>
             <w:webHidden/>
           </w:rPr>
-          <w:instrText xml:space="preserve"> PAGEREF _Toc241868939 \h </w:instrText>
+          <w:instrText xml:space="preserve"> PAGEREF _Toc241871949 \h </w:instrText>
         </w:r>
         <w:r>
           <w:rPr>
@@ -977,7 +977,7 @@
           <w:noProof/>
         </w:rPr>
       </w:pPr>
-      <w:hyperlink w:anchor="_Toc241868940" w:history="1">
+      <w:hyperlink w:anchor="_Toc241871950" w:history="1">
         <w:r>
           <w:rPr>
             <w:rStyle w:val="affa"/>
@@ -1011,7 +1011,7 @@
             <w:noProof/>
             <w:webHidden/>
           </w:rPr>
-          <w:instrText xml:space="preserve"> PAGEREF _Toc241868940 \h </w:instrText>
+          <w:instrText xml:space="preserve"> PAGEREF _Toc241871950 \h </w:instrText>
         </w:r>
         <w:r>
           <w:rPr>
@@ -1052,7 +1052,7 @@
           <w:noProof/>
         </w:rPr>
       </w:pPr>
-      <w:hyperlink w:anchor="_Toc241868941" w:history="1">
+      <w:hyperlink w:anchor="_Toc241871951" w:history="1">
         <w:r>
           <w:rPr>
             <w:rStyle w:val="affa"/>
@@ -1086,7 +1086,7 @@
             <w:noProof/>
             <w:webHidden/>
           </w:rPr>
-          <w:instrText xml:space="preserve"> PAGEREF _Toc241868941 \h </w:instrText>
+          <w:instrText xml:space="preserve"> PAGEREF _Toc241871951 \h </w:instrText>
         </w:r>
         <w:r>
           <w:rPr>
@@ -1127,7 +1127,7 @@
           <w:noProof/>
         </w:rPr>
       </w:pPr>
-      <w:hyperlink w:anchor="_Toc241868942" w:history="1">
+      <w:hyperlink w:anchor="_Toc241871952" w:history="1">
         <w:r>
           <w:rPr>
             <w:rStyle w:val="affa"/>
@@ -1161,7 +1161,7 @@
             <w:noProof/>
             <w:webHidden/>
           </w:rPr>
-          <w:instrText xml:space="preserve"> PAGEREF _Toc241868942 \h </w:instrText>
+          <w:instrText xml:space="preserve"> PAGEREF _Toc241871952 \h </w:instrText>
         </w:r>
         <w:r>
           <w:rPr>
@@ -1202,7 +1202,7 @@
           <w:noProof/>
         </w:rPr>
       </w:pPr>
-      <w:hyperlink w:anchor="_Toc241868943" w:history="1">
+      <w:hyperlink w:anchor="_Toc241871953" w:history="1">
         <w:r>
           <w:rPr>
             <w:rStyle w:val="affa"/>
@@ -1236,7 +1236,7 @@
             <w:noProof/>
             <w:webHidden/>
           </w:rPr>
-          <w:instrText xml:space="preserve"> PAGEREF _Toc241868943 \h </w:instrText>
+          <w:instrText xml:space="preserve"> PAGEREF _Toc241871953 \h </w:instrText>
         </w:r>
         <w:r>
           <w:rPr>
@@ -1277,7 +1277,7 @@
           <w:noProof/>
         </w:rPr>
       </w:pPr>
-      <w:hyperlink w:anchor="_Toc241868944" w:history="1">
+      <w:hyperlink w:anchor="_Toc241871954" w:history="1">
         <w:r>
           <w:rPr>
             <w:rStyle w:val="affa"/>
@@ -1311,7 +1311,7 @@
             <w:noProof/>
             <w:webHidden/>
           </w:rPr>
-          <w:instrText xml:space="preserve"> PAGEREF _Toc241868944 \h </w:instrText>
+          <w:instrText xml:space="preserve"> PAGEREF _Toc241871954 \h </w:instrText>
         </w:r>
         <w:r>
           <w:rPr>
@@ -1352,7 +1352,7 @@
           <w:noProof/>
         </w:rPr>
       </w:pPr>
-      <w:hyperlink w:anchor="_Toc241868945" w:history="1">
+      <w:hyperlink w:anchor="_Toc241871955" w:history="1">
         <w:r>
           <w:rPr>
             <w:rStyle w:val="affa"/>
@@ -1386,7 +1386,7 @@
             <w:noProof/>
             <w:webHidden/>
           </w:rPr>
-          <w:instrText xml:space="preserve"> PAGEREF _Toc241868945 \h </w:instrText>
+          <w:instrText xml:space="preserve"> PAGEREF _Toc241871955 \h </w:instrText>
         </w:r>
         <w:r>
           <w:rPr>
@@ -1427,7 +1427,7 @@
           <w:noProof/>
         </w:rPr>
       </w:pPr>
-      <w:hyperlink w:anchor="_Toc241868946" w:history="1">
+      <w:hyperlink w:anchor="_Toc241871956" w:history="1">
         <w:r>
           <w:rPr>
             <w:rStyle w:val="affa"/>
@@ -1461,7 +1461,7 @@
             <w:noProof/>
             <w:webHidden/>
           </w:rPr>
-          <w:instrText xml:space="preserve"> PAGEREF _Toc241868946 \h </w:instrText>
+          <w:instrText xml:space="preserve"> PAGEREF _Toc241871956 \h </w:instrText>
         </w:r>
         <w:r>
           <w:rPr>
@@ -1502,7 +1502,7 @@
           <w:noProof/>
         </w:rPr>
       </w:pPr>
-      <w:hyperlink w:anchor="_Toc241868947" w:history="1">
+      <w:hyperlink w:anchor="_Toc241871957" w:history="1">
         <w:r>
           <w:rPr>
             <w:rStyle w:val="affa"/>
@@ -1529,7 +1529,7 @@
             <w:noProof/>
             <w:webHidden/>
           </w:rPr>
-          <w:instrText xml:space="preserve"> PAGEREF _Toc241868947 \h </w:instrText>
+          <w:instrText xml:space="preserve"> PAGEREF _Toc241871957 \h </w:instrText>
         </w:r>
         <w:r>
           <w:rPr>
@@ -1570,7 +1570,7 @@
           <w:noProof/>
         </w:rPr>
       </w:pPr>
-      <w:hyperlink w:anchor="_Toc241868948" w:history="1">
+      <w:hyperlink w:anchor="_Toc241871958" w:history="1">
         <w:r>
           <w:rPr>
             <w:rStyle w:val="affa"/>
@@ -1611,7 +1611,7 @@
             <w:noProof/>
             <w:webHidden/>
           </w:rPr>
-          <w:instrText xml:space="preserve"> PAGEREF _Toc241868948 \h </w:instrText>
+          <w:instrText xml:space="preserve"> PAGEREF _Toc241871958 \h </w:instrText>
         </w:r>
         <w:r>
           <w:rPr>
@@ -1652,7 +1652,7 @@
           <w:noProof/>
         </w:rPr>
       </w:pPr>
-      <w:hyperlink w:anchor="_Toc241868949" w:history="1">
+      <w:hyperlink w:anchor="_Toc241871959" w:history="1">
         <w:r>
           <w:rPr>
             <w:rStyle w:val="affa"/>
@@ -1721,7 +1721,7 @@
             <w:noProof/>
             <w:webHidden/>
           </w:rPr>
-          <w:instrText xml:space="preserve"> PAGEREF _Toc241868949 \h </w:instrText>
+          <w:instrText xml:space="preserve"> PAGEREF _Toc241871959 \h </w:instrText>
         </w:r>
         <w:r>
           <w:rPr>
@@ -1766,7 +1766,7 @@
       <w:pPr>
         <w:pStyle w:val="1"/>
       </w:pPr>
-      <w:bookmarkStart w:id="0" w:name="_Toc241868934"/>
+      <w:bookmarkStart w:id="0" w:name="_Toc241871944"/>
       <w:r>
         <w:rPr>
           <w:rFonts w:ascii="Times New Roman" w:eastAsia="新細明體" w:hAnsi="Times New Roman" w:cs="Times New Roman"/>
@@ -1781,13 +1781,13 @@
         <w:spacing w:after="0" w:line="480" w:lineRule="auto"/>
       </w:pPr>
       <w:r>
-        <w:rPr>
-          <w:b/>
-        </w:rPr>
-        <w:t>問題</w:t>
-      </w:r>
-      <w:r>
-        <w:t>：照現行做法放大，約</w:t>
+        <w:t>本提案改以機器學習（</w:t>
+      </w:r>
+      <w:r>
+        <w:t>ML</w:t>
+      </w:r>
+      <w:r>
+        <w:t>）排外撥名單。照現行做法放大，約</w:t>
       </w:r>
       <w:r>
         <w:t xml:space="preserve"> 76% </w:t>
@@ -1799,27 +1799,7 @@
         <w:t xml:space="preserve"> 1</w:t>
       </w:r>
       <w:r>
-        <w:t>）。</w:t>
-      </w:r>
-    </w:p>
-    <w:p>
-      <w:pPr>
-        <w:spacing w:after="0" w:line="480" w:lineRule="auto"/>
-      </w:pPr>
-      <w:r>
-        <w:rPr>
-          <w:b/>
-        </w:rPr>
-        <w:t>建議</w:t>
-      </w:r>
-      <w:r>
-        <w:t>：分兩步改用機器學習（</w:t>
-      </w:r>
-      <w:r>
-        <w:t>ML</w:t>
-      </w:r>
-      <w:r>
-        <w:t>）排外撥名單。第一步排接受機率，少打無效電話；第二步改排打了才會買的人，減少白送的折扣。</w:t>
+        <w:t>）。建議分兩步：第一步排接受機率，少打無效電話；第二步改排打了才會買的人，減少白送的折扣。</w:t>
       </w:r>
     </w:p>
     <w:p>
@@ -2878,7 +2858,7 @@
       <w:pPr>
         <w:pStyle w:val="1"/>
       </w:pPr>
-      <w:bookmarkStart w:id="1" w:name="_Toc241868935"/>
+      <w:bookmarkStart w:id="1" w:name="_Toc241871945"/>
       <w:r>
         <w:rPr>
           <w:rFonts w:ascii="Times New Roman" w:eastAsia="新細明體" w:hAnsi="Times New Roman" w:cs="Times New Roman"/>
@@ -2904,7 +2884,7 @@
         <w:t>商業挑戰</w:t>
       </w:r>
       <w:r>
-        <w:t>：</w:t>
+        <w:t>在於提高轉換率、壓低呼叫中心與折扣成本。</w:t>
       </w:r>
       <w:r>
         <w:t xml:space="preserve">Bank X </w:t>
@@ -2916,17 +2896,17 @@
         <w:t>target group</w:t>
       </w:r>
       <w:r>
-        <w:t>）外撥並給優惠，對照組皆無；目標是提高轉換率、壓低</w:t>
+        <w:t>）外撥並給優</w:t>
       </w:r>
       <w:r>
         <w:lastRenderedPageBreak/>
-        <w:t>呼叫中心與折扣成本。有對照組才量得出增量（</w:t>
+        <w:t>惠，對照組皆無。有對照組才量得出增量（</w:t>
       </w:r>
       <w:r>
         <w:t>uplift</w:t>
       </w:r>
       <w:r>
-        <w:t>），試點是資產；問題在照原樣放大。</w:t>
+        <w:t>），試點是資產，問題在照原樣放大。</w:t>
       </w:r>
     </w:p>
     <w:p>
@@ -2934,13 +2914,34 @@
         <w:spacing w:after="0" w:line="480" w:lineRule="auto"/>
       </w:pPr>
       <w:r>
+        <w:t>看得見的通話成本一輪約</w:t>
+      </w:r>
+      <w:r>
+        <w:t xml:space="preserve"> A$62,905</w:t>
+      </w:r>
+      <w:r>
+        <w:t>，</w:t>
+      </w:r>
+      <w:r>
+        <w:t xml:space="preserve">74.8% </w:t>
+      </w:r>
+      <w:r>
+        <w:t>花在未成交電話（圖</w:t>
+      </w:r>
+      <w:r>
+        <w:t xml:space="preserve"> 1</w:t>
+      </w:r>
+      <w:r>
+        <w:t>），多餘的來電亦打擾客戶、引來客訴並佔用通話產能；惟</w:t>
+      </w:r>
+      <w:r>
         <w:rPr>
           <w:b/>
         </w:rPr>
         <w:t>商業影響</w:t>
       </w:r>
       <w:r>
-        <w:t>：關鍵漏損是看不見的折扣外溢</w:t>
+        <w:t>的關鍵漏損在看不見的折扣外溢</w:t>
       </w:r>
       <w:r>
         <w:t>——</w:t>
@@ -2994,25 +2995,7 @@
         <w:t xml:space="preserve"> 4.2 </w:t>
       </w:r>
       <w:r>
-        <w:t>倍（未計通話費）。看得見的通話成本一輪約</w:t>
-      </w:r>
-      <w:r>
-        <w:t xml:space="preserve"> A$62,905</w:t>
-      </w:r>
-      <w:r>
-        <w:t>，</w:t>
-      </w:r>
-      <w:r>
-        <w:t xml:space="preserve">74.8% </w:t>
-      </w:r>
-      <w:r>
-        <w:t>花在未成交電話（圖</w:t>
-      </w:r>
-      <w:r>
-        <w:t xml:space="preserve"> 1</w:t>
-      </w:r>
-      <w:r>
-        <w:t>）；多餘的來電也打擾客戶、引來客訴並佔用通話產能。</w:t>
+        <w:t>倍（未計通話費）。</w:t>
       </w:r>
     </w:p>
     <w:p>
@@ -3149,7 +3132,7 @@
           <w:noProof/>
         </w:rPr>
         <w:drawing>
-          <wp:inline distT="0" distB="0" distL="0" distR="0" wp14:anchorId="2EDDDD27" wp14:editId="1079F4B7">
+          <wp:inline distT="0" distB="0" distL="0" distR="0" wp14:anchorId="7D052C5E" wp14:editId="4A84102D">
             <wp:extent cx="5688000" cy="4036645"/>
             <wp:effectExtent l="0" t="0" r="0" b="0"/>
             <wp:docPr id="1" name="Picture 1"/>
@@ -3257,7 +3240,7 @@
       <w:pPr>
         <w:pStyle w:val="1"/>
       </w:pPr>
-      <w:bookmarkStart w:id="2" w:name="_Toc241868936"/>
+      <w:bookmarkStart w:id="2" w:name="_Toc241871946"/>
       <w:r>
         <w:rPr>
           <w:rFonts w:ascii="Times New Roman" w:eastAsia="新細明體" w:hAnsi="Times New Roman" w:cs="Times New Roman"/>
@@ -3290,7 +3273,55 @@
         <w:t>supervised binary classification</w:t>
       </w:r>
       <w:r>
-        <w:t>），而非迴歸：模型輸出接受機率，依此排出外撥順序。</w:t>
+        <w:t>）而非迴歸</w:t>
+      </w:r>
+      <w:r>
+        <w:t>——</w:t>
+      </w:r>
+      <w:r>
+        <w:t>模型輸出接受機率，依此排出外撥順序。</w:t>
+      </w:r>
+      <w:r>
+        <w:t xml:space="preserve">ML </w:t>
+      </w:r>
+      <w:r>
+        <w:t>至少要勝過簡單規則：以手機聯絡的客戶轉換率</w:t>
+      </w:r>
+      <w:r>
+        <w:t xml:space="preserve"> 16.6%</w:t>
+      </w:r>
+      <w:r>
+        <w:t>，高於隨機外撥的</w:t>
+      </w:r>
+      <w:r>
+        <w:t xml:space="preserve"> 13.04%</w:t>
+      </w:r>
+      <w:r>
+        <w:t>，惟部分來自月份組成，只當保守的第二基準；即使只看手機客戶，前次行銷成功者轉換率</w:t>
+      </w:r>
+      <w:r>
+        <w:t xml:space="preserve"> 67.2%</w:t>
+      </w:r>
+      <w:r>
+        <w:t>，無紀錄者僅</w:t>
+      </w:r>
+      <w:r>
+        <w:t xml:space="preserve"> 13.1%</w:t>
+      </w:r>
+      <w:r>
+        <w:t>；規則漏掉其他變數。評分卡權重靠經驗，</w:t>
+      </w:r>
+      <w:r>
+        <w:t xml:space="preserve">ML </w:t>
+      </w:r>
+      <w:r>
+        <w:t>則從試點學權重（表</w:t>
+      </w:r>
+      <w:r>
+        <w:t xml:space="preserve"> 2</w:t>
+      </w:r>
+      <w:r>
+        <w:t>）。</w:t>
       </w:r>
     </w:p>
     <w:p>
@@ -3298,96 +3329,49 @@
         <w:spacing w:after="0" w:line="480" w:lineRule="auto"/>
       </w:pPr>
       <w:r>
-        <w:t xml:space="preserve">ML </w:t>
-      </w:r>
-      <w:r>
-        <w:t>至少要勝過簡單規則：以手機聯絡的客戶轉換率</w:t>
-      </w:r>
-      <w:r>
-        <w:t xml:space="preserve"> 16.6%</w:t>
-      </w:r>
-      <w:r>
-        <w:t>，高於隨機外撥的</w:t>
-      </w:r>
-      <w:r>
-        <w:t xml:space="preserve"> 13.04%</w:t>
-      </w:r>
-      <w:r>
-        <w:t>，但部分來自月份組成，只當保守的第二基準。即使只看手機客戶，前次行銷成功者轉換率</w:t>
-      </w:r>
-      <w:r>
-        <w:t xml:space="preserve"> 67.2%</w:t>
-      </w:r>
-      <w:r>
-        <w:t>，無紀錄者僅</w:t>
-      </w:r>
-      <w:r>
-        <w:t xml:space="preserve"> 13.1%</w:t>
-      </w:r>
-      <w:r>
-        <w:t>；規則漏掉其他變數，評分卡權重靠經驗，</w:t>
-      </w:r>
-      <w:r>
-        <w:t xml:space="preserve">ML </w:t>
-      </w:r>
-      <w:r>
-        <w:t>從試點學權重（表</w:t>
+        <w:t>本提案分兩步，先以試點建立接受機率模型，惟機率最高者（如前次成功者）不打也多半會買，只排機率可能加重折扣外溢。現在排不了增量（試點無客戶編號、兩組組成不同，</w:t>
+      </w:r>
+      <w:r>
+        <w:t>3.2</w:t>
+      </w:r>
+      <w:r>
+        <w:t>），故仍先做第一步：此步不需新硬體，轉換率達</w:t>
+      </w:r>
+      <w:r>
+        <w:t xml:space="preserve"> 18% </w:t>
+      </w:r>
+      <w:r>
+        <w:t>時每輪約省</w:t>
+      </w:r>
+      <w:r>
+        <w:t xml:space="preserve"> A$14,900 </w:t>
+      </w:r>
+      <w:r>
+        <w:t>通話費，並累積第二步的對照資料。外溢比例若升逾約</w:t>
+      </w:r>
+      <w:r>
+        <w:t xml:space="preserve"> 9 </w:t>
+      </w:r>
+      <w:r>
+        <w:t>個百分點就抵掉節省，故</w:t>
+      </w:r>
+      <w:r>
+        <w:t xml:space="preserve"> A/B </w:t>
+      </w:r>
+      <w:r>
+        <w:t>以淨值把關（表</w:t>
+      </w:r>
+      <w:r>
+        <w:t xml:space="preserve"> 2 </w:t>
+      </w:r>
+      <w:r>
+        <w:t>註</w:t>
       </w:r>
       <w:r>
         <w:t xml:space="preserve"> 2</w:t>
       </w:r>
       <w:r>
-        <w:t>）。</w:t>
-      </w:r>
-    </w:p>
-    <w:p>
-      <w:pPr>
-        <w:spacing w:after="0" w:line="480" w:lineRule="auto"/>
-      </w:pPr>
-      <w:r>
-        <w:t>方案分兩步：先以試點建立接受機率模型；但機率最高者（如前次成功者）不打也多半會買，只排機率可能加重折扣外溢。仍先做第一步，因為現在排不了增量（試點無客戶編號、兩組組成不同，</w:t>
-      </w:r>
-      <w:r>
-        <w:t>3.2</w:t>
-      </w:r>
-      <w:r>
-        <w:t>）；第一步不需新硬體，轉換率達</w:t>
-      </w:r>
-      <w:r>
-        <w:t xml:space="preserve"> 18% </w:t>
-      </w:r>
-      <w:r>
-        <w:t>時每輪約省</w:t>
-      </w:r>
-      <w:r>
-        <w:t xml:space="preserve"> A$14,900 </w:t>
-      </w:r>
-      <w:r>
-        <w:t>通話費，並累積第二步的對照資料。外溢比例若升逾約</w:t>
-      </w:r>
-      <w:r>
-        <w:t xml:space="preserve"> 9 </w:t>
-      </w:r>
-      <w:r>
-        <w:t>個百分點就抵掉節省，故</w:t>
-      </w:r>
-      <w:r>
-        <w:t xml:space="preserve"> A/B </w:t>
-      </w:r>
-      <w:r>
-        <w:t>以淨值把關（表</w:t>
-      </w:r>
-      <w:r>
-        <w:t xml:space="preserve"> 2 </w:t>
-      </w:r>
-      <w:r>
-        <w:t>註</w:t>
-      </w:r>
-      <w:r>
-        <w:t xml:space="preserve"> 2</w:t>
-      </w:r>
-      <w:r>
-        <w:t>）。五大要求見表</w:t>
+        <w:t>）；五大要求見表</w:t>
       </w:r>
       <w:r>
         <w:t xml:space="preserve"> 3</w:t>
@@ -4384,6 +4368,7 @@
           <w:color w:val="333333"/>
           <w:sz w:val="20"/>
         </w:rPr>
+        <w:lastRenderedPageBreak/>
         <w:t>註</w:t>
       </w:r>
       <w:r>
@@ -5948,7 +5933,7 @@
       <w:pPr>
         <w:pStyle w:val="1"/>
       </w:pPr>
-      <w:bookmarkStart w:id="3" w:name="_Toc241868937"/>
+      <w:bookmarkStart w:id="3" w:name="_Toc241871947"/>
       <w:r>
         <w:rPr>
           <w:rFonts w:ascii="Times New Roman" w:eastAsia="新細明體" w:hAnsi="Times New Roman" w:cs="Times New Roman"/>
@@ -5968,13 +5953,13 @@
         <w:spacing w:after="0" w:line="480" w:lineRule="auto"/>
       </w:pPr>
       <w:r>
-        <w:t>本專案依</w:t>
+        <w:t>本提案依</w:t>
       </w:r>
       <w:r>
         <w:t xml:space="preserve"> CRISP-ML(Q) </w:t>
       </w:r>
       <w:r>
-        <w:t>推進：每階段設品質關卡，未通過就回到對應階段修正（</w:t>
+        <w:t>規劃，每階段設品質關卡，未通過就回到對應階段修正（</w:t>
       </w:r>
       <w:r>
         <w:t>Studer et al., 2021</w:t>
@@ -5987,7 +5972,7 @@
       <w:pPr>
         <w:pStyle w:val="21"/>
       </w:pPr>
-      <w:bookmarkStart w:id="4" w:name="_Toc241868938"/>
+      <w:bookmarkStart w:id="4" w:name="_Toc241871948"/>
       <w:r>
         <w:rPr>
           <w:rFonts w:ascii="Times New Roman" w:eastAsia="新細明體" w:hAnsi="Times New Roman" w:cs="Times New Roman"/>
@@ -6015,6 +6000,78 @@
       <w:r>
         <w:t>：每個外撥日前交付依產能截斷的排序名單，附分數、入選原因與隨機對照組標記，並排除拒接行銷名單。</w:t>
       </w:r>
+      <w:r>
+        <w:rPr>
+          <w:b/>
+        </w:rPr>
+        <w:t>產品商業價值</w:t>
+      </w:r>
+      <w:r>
+        <w:t>：把有限電話與優惠留給打了才會買的客戶，以式</w:t>
+      </w:r>
+      <w:r>
+        <w:t xml:space="preserve"> 1 </w:t>
+      </w:r>
+      <w:r>
+        <w:t>淨值衡量（表</w:t>
+      </w:r>
+      <w:r>
+        <w:t xml:space="preserve"> 4 ⑤</w:t>
+      </w:r>
+      <w:r>
+        <w:t>）；同樣</w:t>
+      </w:r>
+      <w:r>
+        <w:t xml:space="preserve"> 2,300 </w:t>
+      </w:r>
+      <w:r>
+        <w:t>筆成交、轉換率</w:t>
+      </w:r>
+      <w:r>
+        <w:t xml:space="preserve"> 18% </w:t>
+      </w:r>
+      <w:r>
+        <w:t>時，每輪通話成本約省</w:t>
+      </w:r>
+      <w:r>
+        <w:t xml:space="preserve"> A$14,900</w:t>
+      </w:r>
+      <w:r>
+        <w:t>。</w:t>
+      </w:r>
+      <w:r>
+        <w:rPr>
+          <w:b/>
+        </w:rPr>
+        <w:t>成功標準</w:t>
+      </w:r>
+      <w:r>
+        <w:t>：分業務與</w:t>
+      </w:r>
+      <w:r>
+        <w:t xml:space="preserve"> ML </w:t>
+      </w:r>
+      <w:r>
+        <w:t>兩層（表</w:t>
+      </w:r>
+      <w:r>
+        <w:t xml:space="preserve"> 4</w:t>
+      </w:r>
+      <w:r>
+        <w:t>）；在</w:t>
+      </w:r>
+      <w:r>
+        <w:t xml:space="preserve"> 2:1 </w:t>
+      </w:r>
+      <w:r>
+        <w:t>假設下，最貴的錯誤是打給本來就會買的人（表</w:t>
+      </w:r>
+      <w:r>
+        <w:t xml:space="preserve"> 4 </w:t>
+      </w:r>
+      <w:r>
+        <w:t>註）。</w:t>
+      </w:r>
     </w:p>
     <w:p>
       <w:pPr>
@@ -6024,98 +6081,25 @@
         <w:rPr>
           <w:b/>
         </w:rPr>
-        <w:t>產品商業價值</w:t>
-      </w:r>
-      <w:r>
-        <w:t>：把有限電話與優惠留給打了才會買的客戶，以式</w:t>
-      </w:r>
-      <w:r>
-        <w:t xml:space="preserve"> 1 </w:t>
-      </w:r>
-      <w:r>
-        <w:t>淨值衡量（表</w:t>
-      </w:r>
-      <w:r>
-        <w:t xml:space="preserve"> 4 ⑤</w:t>
-      </w:r>
-      <w:r>
-        <w:t>）；同樣</w:t>
-      </w:r>
-      <w:r>
-        <w:t xml:space="preserve"> 2,300 </w:t>
-      </w:r>
-      <w:r>
-        <w:t>筆成交、轉換率</w:t>
-      </w:r>
-      <w:r>
-        <w:t xml:space="preserve"> 18% </w:t>
-      </w:r>
-      <w:r>
-        <w:t>時，每輪通話成本約省</w:t>
-      </w:r>
-      <w:r>
-        <w:t xml:space="preserve"> A$14,900</w:t>
-      </w:r>
-      <w:r>
-        <w:t>。</w:t>
-      </w:r>
-    </w:p>
-    <w:p>
-      <w:pPr>
-        <w:spacing w:after="0" w:line="480" w:lineRule="auto"/>
-      </w:pPr>
+        <w:t>可行性</w:t>
+      </w:r>
+      <w:r>
+        <w:t>：已有概念驗證模型，惟上線版須以撥號前欄位重建；預計沿用現有伺服器與人力。</w:t>
+      </w:r>
       <w:r>
         <w:rPr>
           <w:b/>
         </w:rPr>
-        <w:t>成功標準</w:t>
-      </w:r>
-      <w:r>
-        <w:t>：分業務與</w:t>
-      </w:r>
-      <w:r>
-        <w:t xml:space="preserve"> ML </w:t>
-      </w:r>
-      <w:r>
-        <w:t>兩層（表</w:t>
-      </w:r>
-      <w:r>
-        <w:t xml:space="preserve"> 4</w:t>
-      </w:r>
-      <w:r>
-        <w:t>）；在</w:t>
-      </w:r>
-      <w:r>
-        <w:t xml:space="preserve"> 2:1 </w:t>
-      </w:r>
-      <w:r>
-        <w:t>假設下，最貴的錯誤是打給本來就會買的人（表</w:t>
-      </w:r>
-      <w:r>
-        <w:t xml:space="preserve"> 4 </w:t>
-      </w:r>
-      <w:r>
-        <w:t>註）。</w:t>
-      </w:r>
-    </w:p>
-    <w:p>
-      <w:pPr>
-        <w:spacing w:after="0" w:line="480" w:lineRule="auto"/>
-      </w:pPr>
-      <w:r>
-        <w:rPr>
-          <w:b/>
-        </w:rPr>
-        <w:t>可行性、合規與計畫</w:t>
-      </w:r>
-      <w:r>
-        <w:t>：已有概念驗證模型，上線版須以撥號前欄位重建；預計沿用現有伺服器與人力，</w:t>
+        <w:t>合規與計畫</w:t>
+      </w:r>
+      <w:r>
+        <w:t>：</w:t>
       </w:r>
       <w:r>
         <w:t xml:space="preserve">12 </w:t>
       </w:r>
       <w:r>
-        <w:t>週內驗證。年齡、婚姻狀態能否用於評分先由法遵確認；第</w:t>
+        <w:t>週內驗證；年齡、婚姻狀態能否用於評分先由法遵確認，第</w:t>
       </w:r>
       <w:r>
         <w:t xml:space="preserve"> 12 </w:t>
@@ -8211,7 +8195,7 @@
       <w:pPr>
         <w:pStyle w:val="21"/>
       </w:pPr>
-      <w:bookmarkStart w:id="5" w:name="_Toc241868939"/>
+      <w:bookmarkStart w:id="5" w:name="_Toc241871949"/>
       <w:r>
         <w:rPr>
           <w:rFonts w:ascii="Times New Roman" w:eastAsia="新細明體" w:hAnsi="Times New Roman" w:cs="Times New Roman"/>
@@ -8237,13 +8221,8 @@
         <w:t>資料需求</w:t>
       </w:r>
       <w:r>
-        <w:t>：撥號前客戶屬性、分組與結果都有，但缺客戶編號、外撥日期與觀察期。</w:t>
-      </w:r>
-    </w:p>
-    <w:p>
-      <w:pPr>
-        <w:spacing w:after="0" w:line="480" w:lineRule="auto"/>
-      </w:pPr>
+        <w:t>：撥號前客戶屬性、分組與結果都有，缺客戶編號、外撥日期與觀察期。</w:t>
+      </w:r>
       <w:r>
         <w:rPr>
           <w:b/>
@@ -8266,7 +8245,7 @@
         <w:t>data profile</w:t>
       </w:r>
       <w:r>
-        <w:t>）見表</w:t>
+        <w:t>）：見表</w:t>
       </w:r>
       <w:r>
         <w:t xml:space="preserve"> 5</w:t>
@@ -8274,11 +8253,6 @@
       <w:r>
         <w:t>；通話時長要通話後才知道。</w:t>
       </w:r>
-    </w:p>
-    <w:p>
-      <w:pPr>
-        <w:spacing w:after="0" w:line="480" w:lineRule="auto"/>
-      </w:pPr>
       <w:r>
         <w:rPr>
           <w:b/>
@@ -8304,13 +8278,13 @@
         <w:t xml:space="preserve"> 2.8%</w:t>
       </w:r>
       <w:r>
-        <w:t>，這群人不打也有六成會買；另有</w:t>
+        <w:t>，這群人不打也有六成會買，此差異會墊高增量；另有</w:t>
       </w:r>
       <w:r>
         <w:t xml:space="preserve"> 5,750 </w:t>
       </w:r>
       <w:r>
-        <w:t>列完全相同又無客戶編號。前者會墊高增量，後者須補客戶編號重算。取不到編號或日期就延後，回</w:t>
+        <w:t>列完全相同又無客戶編號，須補客戶編號重算。取不到編號或日期就延後，回</w:t>
       </w:r>
       <w:r>
         <w:t xml:space="preserve"> 3.1 </w:t>
@@ -10484,7 +10458,7 @@
       <w:pPr>
         <w:pStyle w:val="21"/>
       </w:pPr>
-      <w:bookmarkStart w:id="6" w:name="_Toc241868940"/>
+      <w:bookmarkStart w:id="6" w:name="_Toc241871950"/>
       <w:r>
         <w:rPr>
           <w:rFonts w:ascii="Times New Roman" w:eastAsia="新細明體" w:hAnsi="Times New Roman" w:cs="Times New Roman"/>
@@ -10521,11 +10495,6 @@
       <w:r>
         <w:t>：對照組空值補「不適用」、不刪列。</w:t>
       </w:r>
-    </w:p>
-    <w:p>
-      <w:pPr>
-        <w:spacing w:after="0" w:line="480" w:lineRule="auto"/>
-      </w:pPr>
       <w:r>
         <w:rPr>
           <w:b/>
@@ -10533,22 +10502,22 @@
         <w:t>資料建構</w:t>
       </w:r>
       <w:r>
-        <w:t>：只衍生撥號前可得的欄位，不足就回</w:t>
+        <w:t>：只衍生撥號前可得的特徵，不足就回</w:t>
       </w:r>
       <w:r>
         <w:t xml:space="preserve"> 3.2 </w:t>
       </w:r>
       <w:r>
-        <w:t>補收資料；</w:t>
+        <w:t>補收資料。</w:t>
       </w:r>
       <w:r>
         <w:rPr>
           <w:b/>
         </w:rPr>
-        <w:t>資料標準化</w:t>
-      </w:r>
-      <w:r>
-        <w:t>等前處理只在訓練資料擬合（表</w:t>
+        <w:t>標準化</w:t>
+      </w:r>
+      <w:r>
+        <w:t>：連同其他前處理只在訓練資料擬合（表</w:t>
       </w:r>
       <w:r>
         <w:t xml:space="preserve"> 6</w:t>
@@ -11451,7 +11420,7 @@
       <w:pPr>
         <w:pStyle w:val="21"/>
       </w:pPr>
-      <w:bookmarkStart w:id="7" w:name="_Toc241868941"/>
+      <w:bookmarkStart w:id="7" w:name="_Toc241871951"/>
       <w:r>
         <w:rPr>
           <w:rFonts w:ascii="Times New Roman" w:eastAsia="新細明體" w:hAnsi="Times New Roman" w:cs="Times New Roman"/>
@@ -11477,13 +11446,13 @@
         <w:t>模型選擇</w:t>
       </w:r>
       <w:r>
-        <w:t>：邏輯迴歸（</w:t>
+        <w:t>：以邏輯迴歸（</w:t>
       </w:r>
       <w:r>
         <w:t>logistic regression</w:t>
       </w:r>
       <w:r>
-        <w:t>）為基準；隨機森林（</w:t>
+        <w:t>）為基準，隨機森林（</w:t>
       </w:r>
       <w:r>
         <w:t>random forest</w:t>
@@ -11503,11 +11472,6 @@
       <w:r>
         <w:t>）。</w:t>
       </w:r>
-    </w:p>
-    <w:p>
-      <w:pPr>
-        <w:spacing w:after="0" w:line="480" w:lineRule="auto"/>
-      </w:pPr>
       <w:r>
         <w:rPr>
           <w:b/>
@@ -11515,19 +11479,14 @@
         <w:t>模型訓練</w:t>
       </w:r>
       <w:r>
-        <w:t>：成交僅約</w:t>
-      </w:r>
-      <w:r>
-        <w:t xml:space="preserve"> 13%</w:t>
-      </w:r>
-      <w:r>
-        <w:t>，採類別加權；調參只用驗證折，測試資料只用一次。</w:t>
-      </w:r>
-    </w:p>
-    <w:p>
-      <w:pPr>
-        <w:spacing w:after="0" w:line="480" w:lineRule="auto"/>
-      </w:pPr>
+        <w:t>：因成交僅約</w:t>
+      </w:r>
+      <w:r>
+        <w:t xml:space="preserve"> 13% </w:t>
+      </w:r>
+      <w:r>
+        <w:t>而採類別加權；調參只用驗證折，測試資料只用一次。</w:t>
+      </w:r>
       <w:r>
         <w:rPr>
           <w:b/>
@@ -11547,21 +11506,7 @@
         <w:t xml:space="preserve"> 1</w:t>
       </w:r>
       <w:r>
-        <w:t>），可重現、可追溯。</w:t>
-      </w:r>
-    </w:p>
-    <w:p>
-      <w:pPr>
-        <w:spacing w:after="0" w:line="480" w:lineRule="auto"/>
-      </w:pPr>
-      <w:r>
-        <w:rPr>
-          <w:b/>
-        </w:rPr>
-        <w:t>回到哪一階段</w:t>
-      </w:r>
-      <w:r>
-        <w:t>：若都輸給同期手機規則組，回</w:t>
+        <w:t>），可重現、可追溯。若都輸給同期手機規則組，則回</w:t>
       </w:r>
       <w:r>
         <w:t xml:space="preserve"> 3.3 </w:t>
@@ -12535,7 +12480,7 @@
       <w:pPr>
         <w:pStyle w:val="21"/>
       </w:pPr>
-      <w:bookmarkStart w:id="8" w:name="_Toc241868942"/>
+      <w:bookmarkStart w:id="8" w:name="_Toc241871952"/>
       <w:r>
         <w:rPr>
           <w:rFonts w:ascii="Times New Roman" w:eastAsia="新細明體" w:hAnsi="Times New Roman" w:cs="Times New Roman"/>
@@ -12561,7 +12506,7 @@
         <w:t>效能指標</w:t>
       </w:r>
       <w:r>
-        <w:t>：全猜「不成交」準確率就有</w:t>
+        <w:t>：全猜「不成交」，準確率就有</w:t>
       </w:r>
       <w:r>
         <w:t xml:space="preserve"> 88.7%</w:t>
@@ -12581,11 +12526,6 @@
       <w:r>
         <w:t>含通話時長，只當樂觀參考。</w:t>
       </w:r>
-    </w:p>
-    <w:p>
-      <w:pPr>
-        <w:spacing w:after="0" w:line="480" w:lineRule="auto"/>
-      </w:pPr>
       <w:r>
         <w:rPr>
           <w:b/>
@@ -12593,27 +12533,13 @@
         <w:t>上線硬門檻</w:t>
       </w:r>
       <w:r>
-        <w:t>：名單轉換率高於、淨值不低於同期手機規則組，且增量為正；其他面向見表</w:t>
+        <w:t>為名單轉換率高於、淨值不低於同期手機規則組，且增量為正，其他面向見表</w:t>
       </w:r>
       <w:r>
         <w:t xml:space="preserve"> 8</w:t>
       </w:r>
       <w:r>
-        <w:t>。</w:t>
-      </w:r>
-    </w:p>
-    <w:p>
-      <w:pPr>
-        <w:spacing w:after="0" w:line="480" w:lineRule="auto"/>
-      </w:pPr>
-      <w:r>
-        <w:rPr>
-          <w:b/>
-        </w:rPr>
-        <w:t>回到哪一階段</w:t>
-      </w:r>
-      <w:r>
-        <w:t>：召回率（</w:t>
+        <w:t>。召回率（</w:t>
       </w:r>
       <w:r>
         <w:t>recall</w:t>
@@ -12625,7 +12551,7 @@
         <w:t xml:space="preserve"> 3.3 </w:t>
       </w:r>
       <w:r>
-        <w:t>補特徵或</w:t>
+        <w:t>補特徵，或回</w:t>
       </w:r>
       <w:r>
         <w:t xml:space="preserve"> 3.1 </w:t>
@@ -13572,7 +13498,7 @@
       <w:pPr>
         <w:pStyle w:val="21"/>
       </w:pPr>
-      <w:bookmarkStart w:id="9" w:name="_Toc241868943"/>
+      <w:bookmarkStart w:id="9" w:name="_Toc241871953"/>
       <w:r>
         <w:rPr>
           <w:rFonts w:ascii="Times New Roman" w:eastAsia="新細明體" w:hAnsi="Times New Roman" w:cs="Times New Roman"/>
@@ -13598,13 +13524,13 @@
         <w:t>部署方式</w:t>
       </w:r>
       <w:r>
-        <w:t>：離線批次評分（</w:t>
+        <w:t>採離線批次評分（</w:t>
       </w:r>
       <w:r>
         <w:t>batch scoring</w:t>
       </w:r>
       <w:r>
-        <w:t>），外撥日前產出名單，不需即時；平台與安全見表</w:t>
+        <w:t>），外撥日前產出名單，不需即時；平台、安全見表</w:t>
       </w:r>
       <w:r>
         <w:t xml:space="preserve"> 3</w:t>
@@ -13612,11 +13538,6 @@
       <w:r>
         <w:t>。</w:t>
       </w:r>
-    </w:p>
-    <w:p>
-      <w:pPr>
-        <w:spacing w:after="0" w:line="480" w:lineRule="auto"/>
-      </w:pPr>
       <w:r>
         <w:rPr>
           <w:b/>
@@ -13630,7 +13551,7 @@
         <w:t xml:space="preserve"> 9 </w:t>
       </w:r>
       <w:r>
-        <w:t>分階段上線；影子模式兼客服試用，</w:t>
+        <w:t>分階段上線，影子模式兼客服試用，</w:t>
       </w:r>
       <w:r>
         <w:t xml:space="preserve">A/B </w:t>
@@ -13638,11 +13559,6 @@
       <w:r>
         <w:t>試點即線上模型驗證，未過關即停。</w:t>
       </w:r>
-    </w:p>
-    <w:p>
-      <w:pPr>
-        <w:spacing w:after="0" w:line="480" w:lineRule="auto"/>
-      </w:pPr>
       <w:r>
         <w:rPr>
           <w:b/>
@@ -13650,7 +13566,7 @@
         <w:t>常設隨機對照組</w:t>
       </w:r>
       <w:r>
-        <w:t>：每輪保留</w:t>
+        <w:t>每輪保留</w:t>
       </w:r>
       <w:r>
         <w:t xml:space="preserve"> 5–10% </w:t>
@@ -15345,58 +15261,56 @@
           <w:color w:val="333333"/>
           <w:sz w:val="20"/>
         </w:rPr>
-        <w:t>風險</w:t>
-      </w:r>
-      <w:r>
-        <w:rPr>
-          <w:b/>
+        <w:t>風險與對策</w:t>
+      </w:r>
+      <w:r>
+        <w:rPr>
           <w:color w:val="333333"/>
           <w:sz w:val="20"/>
         </w:rPr>
-        <w:t xml:space="preserve"> → </w:t>
-      </w:r>
-      <w:r>
-        <w:rPr>
-          <w:b/>
+        <w:t>：增量可能被高估，故補客戶編號與日期，並以常設對照組重新量增量；通話時長通話後才知道，上線版因此以撥號前欄位重建，</w:t>
+      </w:r>
+      <w:r>
+        <w:rPr>
           <w:color w:val="333333"/>
           <w:sz w:val="20"/>
         </w:rPr>
-        <w:t>對策</w:t>
+        <w:t xml:space="preserve">AUC </w:t>
       </w:r>
       <w:r>
         <w:rPr>
           <w:color w:val="333333"/>
           <w:sz w:val="20"/>
         </w:rPr>
-        <w:t>：增量可能被高估</w:t>
+        <w:t>未達</w:t>
       </w:r>
       <w:r>
         <w:rPr>
           <w:color w:val="333333"/>
           <w:sz w:val="20"/>
         </w:rPr>
-        <w:t xml:space="preserve"> → </w:t>
+        <w:t xml:space="preserve"> 0.75 </w:t>
       </w:r>
       <w:r>
         <w:rPr>
           <w:color w:val="333333"/>
           <w:sz w:val="20"/>
         </w:rPr>
-        <w:t>補客戶編號與日期，以常設對照組重新量增量｜通話時長通話後才知道</w:t>
+        <w:t>即停在離線回測、不進影子模式。公平性由表</w:t>
       </w:r>
       <w:r>
         <w:rPr>
           <w:color w:val="333333"/>
           <w:sz w:val="20"/>
         </w:rPr>
-        <w:t xml:space="preserve"> → </w:t>
+        <w:t xml:space="preserve"> 4 </w:t>
       </w:r>
       <w:r>
         <w:rPr>
           <w:color w:val="333333"/>
           <w:sz w:val="20"/>
         </w:rPr>
-        <w:t>以撥號前欄位重建，上線版</w:t>
+        <w:t>分群門檻（各群</w:t>
       </w:r>
       <w:r>
         <w:rPr>
@@ -15410,84 +15324,28 @@
           <w:color w:val="333333"/>
           <w:sz w:val="20"/>
         </w:rPr>
-        <w:t>未達</w:t>
+        <w:t>差</w:t>
       </w:r>
       <w:r>
         <w:rPr>
           <w:color w:val="333333"/>
           <w:sz w:val="20"/>
         </w:rPr>
-        <w:t xml:space="preserve"> 0.75 </w:t>
+        <w:t xml:space="preserve"> ≤ 0.05</w:t>
       </w:r>
       <w:r>
         <w:rPr>
           <w:color w:val="333333"/>
           <w:sz w:val="20"/>
         </w:rPr>
-        <w:t>就停在離線回測、不進影子模式｜公平性</w:t>
+        <w:t>）與法遵逐批複核把關；第一步可能加重折扣外溢，則由</w:t>
       </w:r>
       <w:r>
         <w:rPr>
           <w:color w:val="333333"/>
           <w:sz w:val="20"/>
         </w:rPr>
-        <w:t xml:space="preserve"> → </w:t>
-      </w:r>
-      <w:r>
-        <w:rPr>
-          <w:color w:val="333333"/>
-          <w:sz w:val="20"/>
-        </w:rPr>
-        <w:t>表</w:t>
-      </w:r>
-      <w:r>
-        <w:rPr>
-          <w:color w:val="333333"/>
-          <w:sz w:val="20"/>
-        </w:rPr>
-        <w:t xml:space="preserve"> 4 </w:t>
-      </w:r>
-      <w:r>
-        <w:rPr>
-          <w:color w:val="333333"/>
-          <w:sz w:val="20"/>
-        </w:rPr>
-        <w:t>分群門檻（各群</w:t>
-      </w:r>
-      <w:r>
-        <w:rPr>
-          <w:color w:val="333333"/>
-          <w:sz w:val="20"/>
-        </w:rPr>
-        <w:t xml:space="preserve"> AUC </w:t>
-      </w:r>
-      <w:r>
-        <w:rPr>
-          <w:color w:val="333333"/>
-          <w:sz w:val="20"/>
-        </w:rPr>
-        <w:t>差</w:t>
-      </w:r>
-      <w:r>
-        <w:rPr>
-          <w:color w:val="333333"/>
-          <w:sz w:val="20"/>
-        </w:rPr>
-        <w:t xml:space="preserve"> ≤ 0.05</w:t>
-      </w:r>
-      <w:r>
-        <w:rPr>
-          <w:color w:val="333333"/>
-          <w:sz w:val="20"/>
-        </w:rPr>
-        <w:t>）＋法遵逐批複核｜第一步可能加重折扣外溢</w:t>
-      </w:r>
-      <w:r>
-        <w:rPr>
-          <w:color w:val="333333"/>
-          <w:sz w:val="20"/>
-        </w:rPr>
-        <w:t xml:space="preserve"> → A/B </w:t>
+        <w:t xml:space="preserve"> A/B </w:t>
       </w:r>
       <w:r>
         <w:rPr>
@@ -15515,7 +15373,7 @@
       <w:pPr>
         <w:pStyle w:val="21"/>
       </w:pPr>
-      <w:bookmarkStart w:id="10" w:name="_Toc241868944"/>
+      <w:bookmarkStart w:id="10" w:name="_Toc241871954"/>
       <w:r>
         <w:rPr>
           <w:rFonts w:ascii="Times New Roman" w:eastAsia="新細明體" w:hAnsi="Times New Roman" w:cs="Times New Roman"/>
@@ -15555,11 +15413,6 @@
       <w:r>
         <w:t>）如對手推出低利率卡，外撥後才知道。</w:t>
       </w:r>
-    </w:p>
-    <w:p>
-      <w:pPr>
-        <w:spacing w:after="0" w:line="480" w:lineRule="auto"/>
-      </w:pPr>
       <w:r>
         <w:rPr>
           <w:b/>
@@ -15573,13 +15426,8 @@
         <w:t xml:space="preserve"> 10 </w:t>
       </w:r>
       <w:r>
-        <w:t>觸發重訓，勝過現行版才替換。</w:t>
-      </w:r>
-    </w:p>
-    <w:p>
-      <w:pPr>
-        <w:spacing w:after="0" w:line="480" w:lineRule="auto"/>
-      </w:pPr>
+        <w:t>觸發重訓，新版勝過現行版才替換。</w:t>
+      </w:r>
       <w:r>
         <w:rPr>
           <w:b/>
@@ -15587,7 +15435,7 @@
         <w:t>資格標準變更</w:t>
       </w:r>
       <w:r>
-        <w:t>：新客群超出訓練母體，必須重驗</w:t>
+        <w:t>時，新客群超出訓練母體，必須重驗</w:t>
       </w:r>
       <w:r>
         <w:t>——</w:t>
@@ -16950,7 +16798,7 @@
       <w:pPr>
         <w:pStyle w:val="1"/>
       </w:pPr>
-      <w:bookmarkStart w:id="11" w:name="_Toc241868945"/>
+      <w:bookmarkStart w:id="11" w:name="_Toc241871955"/>
       <w:r>
         <w:rPr>
           <w:rFonts w:ascii="Times New Roman" w:eastAsia="新細明體" w:hAnsi="Times New Roman" w:cs="Times New Roman"/>
@@ -16977,7 +16825,7 @@
           <w:noProof/>
         </w:rPr>
         <w:drawing>
-          <wp:inline distT="0" distB="0" distL="0" distR="0" wp14:anchorId="31ADD843" wp14:editId="754E5CA0">
+          <wp:inline distT="0" distB="0" distL="0" distR="0" wp14:anchorId="476D7C44" wp14:editId="4E452873">
             <wp:extent cx="5328000" cy="6960774"/>
             <wp:effectExtent l="0" t="0" r="0" b="0"/>
             <wp:docPr id="2" name="Picture 2"/>
@@ -17116,50 +16964,65 @@
         <w:spacing w:after="0" w:line="480" w:lineRule="auto"/>
       </w:pPr>
       <w:r>
+        <w:lastRenderedPageBreak/>
+        <w:t>現況為</w:t>
+      </w:r>
+      <w:r>
+        <w:t xml:space="preserve"> Level 0 </w:t>
+      </w:r>
+      <w:r>
+        <w:t>手動流程，本提案建議升到</w:t>
+      </w:r>
+      <w:r>
+        <w:t xml:space="preserve"> Level 1 </w:t>
+      </w:r>
+      <w:r>
+        <w:t>持續訓練（</w:t>
+      </w:r>
+      <w:r>
+        <w:t>continuous training</w:t>
+      </w:r>
+      <w:r>
+        <w:t>），自動執行第</w:t>
+      </w:r>
+      <w:r>
+        <w:t xml:space="preserve"> 3 </w:t>
+      </w:r>
+      <w:r>
+        <w:t>節整條流程（</w:t>
+      </w:r>
+      <w:r>
+        <w:t>pipeline</w:t>
+      </w:r>
+      <w:r>
+        <w:t>，圖</w:t>
+      </w:r>
+      <w:r>
+        <w:t xml:space="preserve"> 2</w:t>
+      </w:r>
+      <w:r>
+        <w:t>）</w:t>
+      </w:r>
+      <w:r>
+        <w:t>——</w:t>
+      </w:r>
+      <w:r>
+        <w:t>每輪都有新標籤，客群亦會變。</w:t>
+      </w:r>
+      <w:r>
         <w:rPr>
           <w:b/>
         </w:rPr>
-        <w:lastRenderedPageBreak/>
-        <w:t>現況與目標</w:t>
-      </w:r>
-      <w:r>
-        <w:t>：目前為</w:t>
-      </w:r>
-      <w:r>
-        <w:t xml:space="preserve"> Level 0 </w:t>
-      </w:r>
-      <w:r>
-        <w:t>手動流程，建議升到</w:t>
-      </w:r>
-      <w:r>
-        <w:t xml:space="preserve"> Level 1 </w:t>
-      </w:r>
-      <w:r>
-        <w:t>持續訓練（</w:t>
-      </w:r>
-      <w:r>
-        <w:t>continuous training</w:t>
-      </w:r>
-      <w:r>
-        <w:t>）：自動執行第</w:t>
-      </w:r>
-      <w:r>
-        <w:t xml:space="preserve"> 3 </w:t>
-      </w:r>
-      <w:r>
-        <w:t>節整條流程（</w:t>
-      </w:r>
-      <w:r>
-        <w:t>pipeline</w:t>
-      </w:r>
-      <w:r>
-        <w:t>，圖</w:t>
-      </w:r>
-      <w:r>
-        <w:t xml:space="preserve"> 2</w:t>
-      </w:r>
-      <w:r>
-        <w:t>），因每輪都有新標籤、客群會變。</w:t>
+        <w:t>開發端</w:t>
+      </w:r>
+      <w:r>
+        <w:t>的前處理與訓練改為模組化組件，開發與上線共用同一流程，每版記入註冊文件（</w:t>
+      </w:r>
+      <w:r>
+        <w:t>3.4</w:t>
+      </w:r>
+      <w:r>
+        <w:t>）。</w:t>
       </w:r>
     </w:p>
     <w:p>
@@ -17170,86 +17033,58 @@
         <w:rPr>
           <w:b/>
         </w:rPr>
-        <w:t>開發端</w:t>
-      </w:r>
-      <w:r>
-        <w:t>：前處理與訓練改為模組化組件，開發與上線共用同一流程，每版記入註冊文件（</w:t>
-      </w:r>
-      <w:r>
-        <w:t>3.4</w:t>
+        <w:t>運營端</w:t>
+      </w:r>
+      <w:r>
+        <w:t>的資料驗證（</w:t>
+      </w:r>
+      <w:r>
+        <w:t>validation</w:t>
+      </w:r>
+      <w:r>
+        <w:t>）不過即停，模型驗證達表</w:t>
+      </w:r>
+      <w:r>
+        <w:t xml:space="preserve"> 4 </w:t>
+      </w:r>
+      <w:r>
+        <w:t>門檻、人工核准才上線；排程、漂移、效能下降、資格變更觸發重訓（表</w:t>
+      </w:r>
+      <w:r>
+        <w:t xml:space="preserve"> 10</w:t>
+      </w:r>
+      <w:r>
+        <w:t>）。表</w:t>
+      </w:r>
+      <w:r>
+        <w:t xml:space="preserve"> 5</w:t>
+      </w:r>
+      <w:r>
+        <w:t>「預測當下可得？」欄即欄位合約，避免訓練</w:t>
+      </w:r>
+      <w:r>
+        <w:t>—</w:t>
+      </w:r>
+      <w:r>
+        <w:t>服務偏斜（</w:t>
+      </w:r>
+      <w:r>
+        <w:t>training-serving skew</w:t>
       </w:r>
       <w:r>
         <w:t>）。</w:t>
       </w:r>
-    </w:p>
-    <w:p>
-      <w:pPr>
-        <w:spacing w:after="0" w:line="480" w:lineRule="auto"/>
-      </w:pPr>
-      <w:r>
-        <w:rPr>
-          <w:b/>
-        </w:rPr>
-        <w:t>運營端</w:t>
-      </w:r>
-      <w:r>
-        <w:t>：資料驗證（</w:t>
-      </w:r>
-      <w:r>
-        <w:t>validation</w:t>
-      </w:r>
-      <w:r>
-        <w:t>）不過即停；模型驗證達表</w:t>
-      </w:r>
-      <w:r>
-        <w:t xml:space="preserve"> 4 </w:t>
-      </w:r>
-      <w:r>
-        <w:t>門檻、人工核准才上線；排程、漂移、效能下降、資格變更觸發重訓（表</w:t>
-      </w:r>
-      <w:r>
-        <w:t xml:space="preserve"> 10</w:t>
-      </w:r>
-      <w:r>
-        <w:t>）。表</w:t>
-      </w:r>
-      <w:r>
-        <w:t xml:space="preserve"> 5</w:t>
-      </w:r>
-      <w:r>
-        <w:t>「預測當下可得？」欄即欄位合約，避免訓練</w:t>
-      </w:r>
-      <w:r>
-        <w:t>—</w:t>
-      </w:r>
-      <w:r>
-        <w:t>服務偏斜（</w:t>
-      </w:r>
-      <w:r>
-        <w:t>training-serving skew</w:t>
-      </w:r>
-      <w:r>
-        <w:t>）。</w:t>
-      </w:r>
-    </w:p>
-    <w:p>
-      <w:pPr>
-        <w:spacing w:after="0" w:line="480" w:lineRule="auto"/>
-      </w:pPr>
-      <w:r>
-        <w:rPr>
-          <w:b/>
-        </w:rPr>
-        <w:t>暫不採</w:t>
-      </w:r>
-      <w:r>
-        <w:rPr>
-          <w:b/>
-        </w:rPr>
-        <w:t xml:space="preserve"> Level 2</w:t>
-      </w:r>
-      <w:r>
-        <w:t>：單一產品與模型、流程少改；升級條件見表</w:t>
+      <w:r>
+        <w:t xml:space="preserve">Level 2 </w:t>
+      </w:r>
+      <w:r>
+        <w:t>暫不採用</w:t>
+      </w:r>
+      <w:r>
+        <w:t>——</w:t>
+      </w:r>
+      <w:r>
+        <w:t>單一產品與模型、流程少改，升級條件見表</w:t>
       </w:r>
       <w:r>
         <w:t xml:space="preserve"> 11 </w:t>
@@ -18382,7 +18217,7 @@
           <w:color w:val="333333"/>
           <w:sz w:val="20"/>
         </w:rPr>
-        <w:t>的可選元件；本案只有一個批次評分模型，先以表</w:t>
+        <w:t>的可選元件；本提案只有一個批次評分模型，先以表</w:t>
       </w:r>
       <w:r>
         <w:rPr>
@@ -18546,7 +18381,7 @@
       <w:pPr>
         <w:pStyle w:val="1"/>
       </w:pPr>
-      <w:bookmarkStart w:id="12" w:name="_Toc241868946"/>
+      <w:bookmarkStart w:id="12" w:name="_Toc241871956"/>
       <w:r>
         <w:rPr>
           <w:rFonts w:ascii="Times New Roman" w:eastAsia="新細明體" w:hAnsi="Times New Roman" w:cs="Times New Roman"/>
@@ -18569,10 +18404,10 @@
         <w:rPr>
           <w:b/>
         </w:rPr>
-        <w:t>結論</w:t>
-      </w:r>
-      <w:r>
-        <w:t>：現行做法不宜照原樣放大；建議分兩步導入機器學習，</w:t>
+        <w:t>提請決定</w:t>
+      </w:r>
+      <w:r>
+        <w:t>：現行做法不宜照原樣放大，宜分兩步導入機器學習，</w:t>
       </w:r>
       <w:r>
         <w:t xml:space="preserve">12 </w:t>
@@ -19092,7 +18927,7 @@
       <w:pPr>
         <w:pStyle w:val="1"/>
       </w:pPr>
-      <w:bookmarkStart w:id="13" w:name="_Toc241868947"/>
+      <w:bookmarkStart w:id="13" w:name="_Toc241871957"/>
       <w:r>
         <w:rPr>
           <w:rFonts w:ascii="Times New Roman" w:eastAsia="新細明體" w:hAnsi="Times New Roman" w:cs="Times New Roman"/>
@@ -19195,7 +19030,7 @@
       <w:pPr>
         <w:pStyle w:val="1"/>
       </w:pPr>
-      <w:bookmarkStart w:id="14" w:name="_Toc241868948"/>
+      <w:bookmarkStart w:id="14" w:name="_Toc241871958"/>
       <w:r>
         <w:rPr>
           <w:rFonts w:ascii="Times New Roman" w:eastAsia="新細明體" w:hAnsi="Times New Roman" w:cs="Times New Roman"/>
@@ -22830,7 +22665,7 @@
       <w:pPr>
         <w:pStyle w:val="1"/>
       </w:pPr>
-      <w:bookmarkStart w:id="15" w:name="_Toc241868949"/>
+      <w:bookmarkStart w:id="15" w:name="_Toc241871959"/>
       <w:r>
         <w:rPr>
           <w:rFonts w:ascii="Times New Roman" w:eastAsia="新細明體" w:hAnsi="Times New Roman" w:cs="Times New Roman"/>
@@ -23278,31 +23113,31 @@
       </w:rPr>
     </w:lvl>
   </w:abstractNum>
-  <w:num w:numId="1" w16cid:durableId="1432700023">
+  <w:num w:numId="1" w16cid:durableId="1528060296">
     <w:abstractNumId w:val="8"/>
   </w:num>
-  <w:num w:numId="2" w16cid:durableId="1971202679">
+  <w:num w:numId="2" w16cid:durableId="16081605">
     <w:abstractNumId w:val="6"/>
   </w:num>
-  <w:num w:numId="3" w16cid:durableId="2009364754">
+  <w:num w:numId="3" w16cid:durableId="1033727498">
     <w:abstractNumId w:val="5"/>
   </w:num>
-  <w:num w:numId="4" w16cid:durableId="1512067152">
+  <w:num w:numId="4" w16cid:durableId="987900622">
     <w:abstractNumId w:val="4"/>
   </w:num>
-  <w:num w:numId="5" w16cid:durableId="1501703162">
+  <w:num w:numId="5" w16cid:durableId="432555909">
     <w:abstractNumId w:val="7"/>
   </w:num>
-  <w:num w:numId="6" w16cid:durableId="1796025489">
+  <w:num w:numId="6" w16cid:durableId="39863093">
     <w:abstractNumId w:val="3"/>
   </w:num>
-  <w:num w:numId="7" w16cid:durableId="165289675">
+  <w:num w:numId="7" w16cid:durableId="1640768113">
     <w:abstractNumId w:val="2"/>
   </w:num>
-  <w:num w:numId="8" w16cid:durableId="2023118515">
+  <w:num w:numId="8" w16cid:durableId="1577013437">
     <w:abstractNumId w:val="1"/>
   </w:num>
-  <w:num w:numId="9" w16cid:durableId="584463852">
+  <w:num w:numId="9" w16cid:durableId="859853495">
     <w:abstractNumId w:val="0"/>
   </w:num>
 </w:numbering>
@@ -34700,7 +34535,7 @@
     <w:autoRedefine/>
     <w:uiPriority w:val="39"/>
     <w:unhideWhenUsed/>
-    <w:rsid w:val="007C3609"/>
+    <w:rsid w:val="006C1C27"/>
   </w:style>
   <w:style w:type="paragraph" w:styleId="2a">
     <w:name w:val="toc 2"/>
@@ -34709,7 +34544,7 @@
     <w:autoRedefine/>
     <w:uiPriority w:val="39"/>
     <w:unhideWhenUsed/>
-    <w:rsid w:val="007C3609"/>
+    <w:rsid w:val="006C1C27"/>
     <w:pPr>
       <w:ind w:leftChars="200" w:left="480"/>
     </w:pPr>
@@ -34719,7 +34554,7 @@
     <w:basedOn w:val="a2"/>
     <w:uiPriority w:val="99"/>
     <w:unhideWhenUsed/>
-    <w:rsid w:val="007C3609"/>
+    <w:rsid w:val="006C1C27"/>
     <w:rPr>
       <w:color w:val="0000FF" w:themeColor="hyperlink"/>
       <w:u w:val="single"/>

</xml_diff>